<commit_message>
agregando enumeracion para tipo de pago y confimacion de la reserva
</commit_message>
<xml_diff>
--- a/Errores y soluciones.docx
+++ b/Errores y soluciones.docx
@@ -23,7 +23,7 @@
                     <pic:cNvPicPr/>
                   </pic:nvPicPr>
                   <pic:blipFill>
-                    <a:blip r:embed="rId4"/>
+                    <a:blip r:embed="rId5"/>
                     <a:stretch>
                       <a:fillRect/>
                     </a:stretch>
@@ -44,6 +44,165 @@
         </w:drawing>
       </w:r>
     </w:p>
+    <w:p/>
+    <w:p>
+      <w:pPr>
+        <w:pStyle w:val="Prrafodelista"/>
+        <w:numPr>
+          <w:ilvl w:val="0"/>
+          <w:numId w:val="1"/>
+        </w:numPr>
+        <w:rPr>
+          <w:b/>
+          <w:bCs/>
+        </w:rPr>
+      </w:pPr>
+      <w:r>
+        <w:rPr>
+          <w:b/>
+          <w:bCs/>
+        </w:rPr>
+        <w:t xml:space="preserve">No se   envían las fechas al controlador </w:t>
+      </w:r>
+    </w:p>
+    <w:p>
+      <w:pPr>
+        <w:ind w:left="45"/>
+        <w:rPr>
+          <w:b/>
+          <w:bCs/>
+        </w:rPr>
+      </w:pPr>
+      <w:r>
+        <w:rPr>
+          <w:b/>
+          <w:bCs/>
+        </w:rPr>
+        <w:t>Error:</w:t>
+      </w:r>
+    </w:p>
+    <w:p>
+      <w:pPr>
+        <w:ind w:left="45"/>
+      </w:pPr>
+      <w:r>
+        <w:t>Se envía las fechas en un input no editable y llegaban en formato 1:00:00</w:t>
+      </w:r>
+    </w:p>
+    <w:p>
+      <w:pPr>
+        <w:ind w:left="45"/>
+        <w:rPr>
+          <w:b/>
+          <w:bCs/>
+        </w:rPr>
+      </w:pPr>
+      <w:proofErr w:type="spellStart"/>
+      <w:r>
+        <w:rPr>
+          <w:b/>
+          <w:bCs/>
+        </w:rPr>
+        <w:t>Solucion</w:t>
+      </w:r>
+      <w:proofErr w:type="spellEnd"/>
+      <w:r>
+        <w:rPr>
+          <w:b/>
+          <w:bCs/>
+        </w:rPr>
+        <w:t>:</w:t>
+      </w:r>
+    </w:p>
+    <w:p>
+      <w:pPr>
+        <w:ind w:left="45"/>
+      </w:pPr>
+      <w:r>
+        <w:t xml:space="preserve">Se debe quitar la propiedad </w:t>
+      </w:r>
+      <w:proofErr w:type="spellStart"/>
+      <w:r>
+        <w:t>readonly</w:t>
+      </w:r>
+      <w:proofErr w:type="spellEnd"/>
+      <w:r>
+        <w:t xml:space="preserve"> </w:t>
+      </w:r>
+      <w:proofErr w:type="gramStart"/>
+      <w:r>
+        <w:t>de los input</w:t>
+      </w:r>
+      <w:proofErr w:type="gramEnd"/>
+      <w:r>
+        <w:t xml:space="preserve"> y hacerlos ocultos, además de asignarles un </w:t>
+      </w:r>
+      <w:proofErr w:type="spellStart"/>
+      <w:r>
+        <w:t>name</w:t>
+      </w:r>
+      <w:proofErr w:type="spellEnd"/>
+      <w:r>
+        <w:t xml:space="preserve"> que también coincida con el nombre en el método del controlador</w:t>
+      </w:r>
+      <w:r>
+        <w:t>.</w:t>
+      </w:r>
+    </w:p>
+    <w:p>
+      <w:pPr>
+        <w:ind w:left="45"/>
+      </w:pPr>
+      <w:r>
+        <w:rPr>
+          <w:noProof/>
+        </w:rPr>
+        <w:drawing>
+          <wp:inline distT="0" distB="0" distL="0" distR="0" wp14:anchorId="584CEBA7" wp14:editId="766E5221">
+            <wp:extent cx="5612130" cy="2877185"/>
+            <wp:effectExtent l="0" t="0" r="7620" b="0"/>
+            <wp:docPr id="803278680" name="Imagen 1"/>
+            <wp:cNvGraphicFramePr>
+              <a:graphicFrameLocks xmlns:a="http://schemas.openxmlformats.org/drawingml/2006/main" noChangeAspect="1"/>
+            </wp:cNvGraphicFramePr>
+            <a:graphic xmlns:a="http://schemas.openxmlformats.org/drawingml/2006/main">
+              <a:graphicData uri="http://schemas.openxmlformats.org/drawingml/2006/picture">
+                <pic:pic xmlns:pic="http://schemas.openxmlformats.org/drawingml/2006/picture">
+                  <pic:nvPicPr>
+                    <pic:cNvPr id="803278680" name=""/>
+                    <pic:cNvPicPr/>
+                  </pic:nvPicPr>
+                  <pic:blipFill>
+                    <a:blip r:embed="rId6"/>
+                    <a:stretch>
+                      <a:fillRect/>
+                    </a:stretch>
+                  </pic:blipFill>
+                  <pic:spPr>
+                    <a:xfrm>
+                      <a:off x="0" y="0"/>
+                      <a:ext cx="5612130" cy="2877185"/>
+                    </a:xfrm>
+                    <a:prstGeom prst="rect">
+                      <a:avLst/>
+                    </a:prstGeom>
+                  </pic:spPr>
+                </pic:pic>
+              </a:graphicData>
+            </a:graphic>
+          </wp:inline>
+        </w:drawing>
+      </w:r>
+    </w:p>
+    <w:p>
+      <w:pPr>
+        <w:ind w:left="45"/>
+        <w:rPr>
+          <w:b/>
+          <w:bCs/>
+        </w:rPr>
+      </w:pPr>
+    </w:p>
     <w:sectPr>
       <w:pgSz w:w="12240" w:h="15840"/>
       <w:pgMar w:top="1417" w:right="1701" w:bottom="1417" w:left="1701" w:header="708" w:footer="708" w:gutter="0"/>
@@ -52,6 +211,103 @@
     </w:sectPr>
   </w:body>
 </w:document>
+</file>
+
+<file path=word/numbering.xml><?xml version="1.0" encoding="utf-8"?>
+<w:numbering xmlns:wpc="http://schemas.microsoft.com/office/word/2010/wordprocessingCanvas" xmlns:cx="http://schemas.microsoft.com/office/drawing/2014/chartex" xmlns:cx1="http://schemas.microsoft.com/office/drawing/2015/9/8/chartex" xmlns:cx2="http://schemas.microsoft.com/office/drawing/2015/10/21/chartex" xmlns:cx3="http://schemas.microsoft.com/office/drawing/2016/5/9/chartex" xmlns:cx4="http://schemas.microsoft.com/office/drawing/2016/5/10/chartex" xmlns:cx5="http://schemas.microsoft.com/office/drawing/2016/5/11/chartex" xmlns:cx6="http://schemas.microsoft.com/office/drawing/2016/5/12/chartex" xmlns:cx7="http://schemas.microsoft.com/office/drawing/2016/5/13/chartex" xmlns:cx8="http://schemas.microsoft.com/office/drawing/2016/5/14/chartex" xmlns:mc="http://schemas.openxmlformats.org/markup-compatibility/2006" xmlns:aink="http://schemas.microsoft.com/office/drawing/2016/ink" xmlns:am3d="http://schemas.microsoft.com/office/drawing/2017/model3d" xmlns:o="urn:schemas-microsoft-com:office:office" xmlns:oel="http://schemas.microsoft.com/office/2019/extlst" xmlns:r="http://schemas.openxmlformats.org/officeDocument/2006/relationships" xmlns:m="http://schemas.openxmlformats.org/officeDocument/2006/math" xmlns:v="urn:schemas-microsoft-com:vml" xmlns:wp14="http://schemas.microsoft.com/office/word/2010/wordprocessingDrawing" xmlns:wp="http://schemas.openxmlformats.org/drawingml/2006/wordprocessingDrawing" xmlns:w10="urn:schemas-microsoft-com:office:word" xmlns:w="http://schemas.openxmlformats.org/wordprocessingml/2006/main" xmlns:w14="http://schemas.microsoft.com/office/word/2010/wordml" xmlns:w15="http://schemas.microsoft.com/office/word/2012/wordml" xmlns:w16cex="http://schemas.microsoft.com/office/word/2018/wordml/cex" xmlns:w16cid="http://schemas.microsoft.com/office/word/2016/wordml/cid" xmlns:w16="http://schemas.microsoft.com/office/word/2018/wordml" xmlns:w16du="http://schemas.microsoft.com/office/word/2023/wordml/word16du" xmlns:w16sdtdh="http://schemas.microsoft.com/office/word/2020/wordml/sdtdatahash" xmlns:w16sdtfl="http://schemas.microsoft.com/office/word/2024/wordml/sdtformatlock" xmlns:w16se="http://schemas.microsoft.com/office/word/2015/wordml/symex" xmlns:wpg="http://schemas.microsoft.com/office/word/2010/wordprocessingGroup" xmlns:wpi="http://schemas.microsoft.com/office/word/2010/wordprocessingInk" xmlns:wne="http://schemas.microsoft.com/office/word/2006/wordml" xmlns:wps="http://schemas.microsoft.com/office/word/2010/wordprocessingShape" mc:Ignorable="w14 w15 w16se w16cid w16 w16cex w16sdtdh w16sdtfl w16du wp14">
+  <w:abstractNum w:abstractNumId="0" w15:restartNumberingAfterBreak="0">
+    <w:nsid w:val="6F207685"/>
+    <w:multiLevelType w:val="hybridMultilevel"/>
+    <w:tmpl w:val="BB4ABF8A"/>
+    <w:lvl w:ilvl="0" w:tplc="91FABD88">
+      <w:start w:val="1"/>
+      <w:numFmt w:val="decimal"/>
+      <w:lvlText w:val="%1."/>
+      <w:lvlJc w:val="left"/>
+      <w:pPr>
+        <w:ind w:left="405" w:hanging="360"/>
+      </w:pPr>
+      <w:rPr>
+        <w:rFonts w:hint="default"/>
+      </w:rPr>
+    </w:lvl>
+    <w:lvl w:ilvl="1" w:tplc="140A0019" w:tentative="1">
+      <w:start w:val="1"/>
+      <w:numFmt w:val="lowerLetter"/>
+      <w:lvlText w:val="%2."/>
+      <w:lvlJc w:val="left"/>
+      <w:pPr>
+        <w:ind w:left="1125" w:hanging="360"/>
+      </w:pPr>
+    </w:lvl>
+    <w:lvl w:ilvl="2" w:tplc="140A001B" w:tentative="1">
+      <w:start w:val="1"/>
+      <w:numFmt w:val="lowerRoman"/>
+      <w:lvlText w:val="%3."/>
+      <w:lvlJc w:val="right"/>
+      <w:pPr>
+        <w:ind w:left="1845" w:hanging="180"/>
+      </w:pPr>
+    </w:lvl>
+    <w:lvl w:ilvl="3" w:tplc="140A000F" w:tentative="1">
+      <w:start w:val="1"/>
+      <w:numFmt w:val="decimal"/>
+      <w:lvlText w:val="%4."/>
+      <w:lvlJc w:val="left"/>
+      <w:pPr>
+        <w:ind w:left="2565" w:hanging="360"/>
+      </w:pPr>
+    </w:lvl>
+    <w:lvl w:ilvl="4" w:tplc="140A0019" w:tentative="1">
+      <w:start w:val="1"/>
+      <w:numFmt w:val="lowerLetter"/>
+      <w:lvlText w:val="%5."/>
+      <w:lvlJc w:val="left"/>
+      <w:pPr>
+        <w:ind w:left="3285" w:hanging="360"/>
+      </w:pPr>
+    </w:lvl>
+    <w:lvl w:ilvl="5" w:tplc="140A001B" w:tentative="1">
+      <w:start w:val="1"/>
+      <w:numFmt w:val="lowerRoman"/>
+      <w:lvlText w:val="%6."/>
+      <w:lvlJc w:val="right"/>
+      <w:pPr>
+        <w:ind w:left="4005" w:hanging="180"/>
+      </w:pPr>
+    </w:lvl>
+    <w:lvl w:ilvl="6" w:tplc="140A000F" w:tentative="1">
+      <w:start w:val="1"/>
+      <w:numFmt w:val="decimal"/>
+      <w:lvlText w:val="%7."/>
+      <w:lvlJc w:val="left"/>
+      <w:pPr>
+        <w:ind w:left="4725" w:hanging="360"/>
+      </w:pPr>
+    </w:lvl>
+    <w:lvl w:ilvl="7" w:tplc="140A0019" w:tentative="1">
+      <w:start w:val="1"/>
+      <w:numFmt w:val="lowerLetter"/>
+      <w:lvlText w:val="%8."/>
+      <w:lvlJc w:val="left"/>
+      <w:pPr>
+        <w:ind w:left="5445" w:hanging="360"/>
+      </w:pPr>
+    </w:lvl>
+    <w:lvl w:ilvl="8" w:tplc="140A001B" w:tentative="1">
+      <w:start w:val="1"/>
+      <w:numFmt w:val="lowerRoman"/>
+      <w:lvlText w:val="%9."/>
+      <w:lvlJc w:val="right"/>
+      <w:pPr>
+        <w:ind w:left="6165" w:hanging="180"/>
+      </w:pPr>
+    </w:lvl>
+  </w:abstractNum>
+  <w:num w:numId="1" w16cid:durableId="101849504">
+    <w:abstractNumId w:val="0"/>
+  </w:num>
+</w:numbering>
 </file>
 
 <file path=word/styles.xml><?xml version="1.0" encoding="utf-8"?>

</xml_diff>